<commit_message>
Now can read pdfs
</commit_message>
<xml_diff>
--- a/ v  ME 25 0924.docx
+++ b/ v  ME 25 0924.docx
@@ -17,42 +17,7 @@
           <w:tcPr>
             <w:tcW w:type="dxa" w:w="2880"/>
           </w:tcPr>
-          <w:p>
-            <w:r>
-              <w:drawing>
-                <wp:inline xmlns:a="http://schemas.openxmlformats.org/drawingml/2006/main" xmlns:pic="http://schemas.openxmlformats.org/drawingml/2006/picture">
-                  <wp:extent cx="1143000" cy="1143000"/>
-                  <wp:docPr id="1" name="Picture 1"/>
-                  <wp:cNvGraphicFramePr>
-                    <a:graphicFrameLocks noChangeAspect="1"/>
-                  </wp:cNvGraphicFramePr>
-                  <a:graphic>
-                    <a:graphicData uri="http://schemas.openxmlformats.org/drawingml/2006/picture">
-                      <pic:pic>
-                        <pic:nvPicPr>
-                          <pic:cNvPr id="0" name="Coat_of_arms.png"/>
-                          <pic:cNvPicPr/>
-                        </pic:nvPicPr>
-                        <pic:blipFill>
-                          <a:blip r:embed="rId9"/>
-                          <a:stretch>
-                            <a:fillRect/>
-                          </a:stretch>
-                        </pic:blipFill>
-                        <pic:spPr>
-                          <a:xfrm>
-                            <a:off x="0" y="0"/>
-                            <a:ext cx="1143000" cy="1143000"/>
-                          </a:xfrm>
-                          <a:prstGeom prst="rect"/>
-                        </pic:spPr>
-                      </pic:pic>
-                    </a:graphicData>
-                  </a:graphic>
-                </wp:inline>
-              </w:drawing>
-            </w:r>
-          </w:p>
+          <w:p/>
         </w:tc>
         <w:tc>
           <w:tcPr>
@@ -135,7 +100,7 @@
           </w:tcPr>
           <w:p>
             <w:r>
-              <w:t>The full names of the children</w:t>
+              <w:t>The full name of the child</w:t>
             </w:r>
           </w:p>
         </w:tc>
@@ -155,7 +120,7 @@
           </w:tcPr>
           <w:p>
             <w:r>
-              <w:t>Dates of Birth</w:t>
+              <w:t>Date of Birth</w:t>
             </w:r>
           </w:p>
         </w:tc>
@@ -167,39 +132,7 @@
           </w:tcPr>
           <w:p>
             <w:r>
-              <w:t>Arthur Jame</w:t>
-            </w:r>
-          </w:p>
-        </w:tc>
-        <w:tc>
-          <w:tcPr>
-            <w:tcW w:type="dxa" w:w="2880"/>
-          </w:tcPr>
-          <w:p>
-            <w:r>
-              <w:t>boy</w:t>
-            </w:r>
-          </w:p>
-        </w:tc>
-        <w:tc>
-          <w:tcPr>
-            <w:tcW w:type="dxa" w:w="2880"/>
-          </w:tcPr>
-          <w:p>
-            <w:r>
-              <w:t>01 Jan 2021</w:t>
-            </w:r>
-          </w:p>
-        </w:tc>
-      </w:tr>
-      <w:tr>
-        <w:tc>
-          <w:tcPr>
-            <w:tcW w:type="dxa" w:w="2880"/>
-          </w:tcPr>
-          <w:p>
-            <w:r>
-              <w:t>Fenella Jame</w:t>
+              <w:t xml:space="preserve"> </w:t>
             </w:r>
           </w:p>
         </w:tc>
@@ -217,7 +150,7 @@
           </w:tcPr>
           <w:p>
             <w:r>
-              <w:t>12 Jun 2021</w:t>
+              <w:t>02/06/2016</w:t>
             </w:r>
           </w:p>
         </w:tc>
@@ -258,7 +191,7 @@
     <w:p/>
     <w:p>
       <w:r>
-        <w:t>Before Deputy District Judge Campbell  in private on  12 June 2025 .</w:t>
+        <w:t>Before Deputy District Judge Jane Campbell  in private on  02 June 2026  at an interim hearing .</w:t>
       </w:r>
     </w:p>
     <w:tbl>
@@ -369,17 +302,7 @@
         <w:pStyle w:val="ListNumber"/>
       </w:pPr>
       <w:r>
-        <w:t>The “relevant children” within the meaning of Family Law Act 1996 are:</w:t>
-        <w:br/>
-        <w:t xml:space="preserve">  a</w:t>
-        <w:tab/>
-        <w:t>Arthur Jame, a boy born on 12/06/2021.</w:t>
-        <w:br/>
-        <w:br/>
-        <w:t xml:space="preserve">  b</w:t>
-        <w:tab/>
-        <w:t>Fenella Jame, a  born on 12/06/2021.</w:t>
-        <w:br/>
+        <w:t>The relevant child within the meaning of the Family Law Act 1995 is  , a  born on 02/06/2016.</w:t>
       </w:r>
     </w:p>
     <w:p>
@@ -403,7 +326,7 @@
         <w:pStyle w:val="ListNumber"/>
       </w:pPr>
       <w:r>
-        <w:t xml:space="preserve">This is a non-molestation order and an occupation order made against the Respondent    on 12 June 2025 by Deputy District Judge Campbell on the application of the Appplicant   </w:t>
+        <w:t xml:space="preserve">This is  made against the Respondent    on 02 June 2026 by Deputy District Judge Jane Campbell on the application of the Appplicant   </w:t>
       </w:r>
     </w:p>
     <w:p>
@@ -411,7 +334,7 @@
         <w:pStyle w:val="ListNumber"/>
       </w:pPr>
       <w:r>
-        <w:t>This order was made at a hearing without notice to the Respondent .The Respondent has the right to apply to the court to vary or discharge the ordersee paragraph below</w:t>
+        <w:t>This order was made at a hearing on notice to the respondent.</w:t>
       </w:r>
     </w:p>
     <w:p>
@@ -435,7 +358,47 @@
         <w:pStyle w:val="ListNumber"/>
       </w:pPr>
       <w:r>
-        <w:t>This order shall last until 12 December 2025 unless it is set aside or varied before then by an order of the court.</w:t>
+        <w:t>This order shall last until 2 December 2026 unless it is set aside or varied before then by an order of the court.</w:t>
+      </w:r>
+    </w:p>
+    <w:p>
+      <w:pPr>
+        <w:pStyle w:val="ListNumber"/>
+      </w:pPr>
+      <w:r>
+        <w:t>The Respondent   must not use or threaten violence against the Applicant   and must not instruct, encourage or in any way suggest any other person should do so.</w:t>
+      </w:r>
+    </w:p>
+    <w:p>
+      <w:pPr>
+        <w:pStyle w:val="ListNumber"/>
+      </w:pPr>
+      <w:r>
+        <w:t>The Respondent   must not intimidate, harass or pester the Applicant    and must not instruct, encourage or in any way suggest any other person should do so.</w:t>
+      </w:r>
+    </w:p>
+    <w:p>
+      <w:pPr>
+        <w:pStyle w:val="ListNumber"/>
+      </w:pPr>
+      <w:r>
+        <w:t>The Respondent,  , must not telephone, text, email or otherwise contact the Applicant  , including via social networking websites or other forms of electronic messaging.</w:t>
+      </w:r>
+    </w:p>
+    <w:p>
+      <w:pPr>
+        <w:pStyle w:val="ListNumber"/>
+      </w:pPr>
+      <w:r>
+        <w:t>The Respondent,  , must not damage, attempt to damage or threaten to damageany property owned by or in the possession or controlof the Applicant  ,and must not instruct,encourage or in any way suggest that any other person should do so.</w:t>
+      </w:r>
+    </w:p>
+    <w:p>
+      <w:pPr>
+        <w:pStyle w:val="ListNumber"/>
+      </w:pPr>
+      <w:r>
+        <w:t>The Respondent  , must not damage, attempt to damage or threaten to damagethe property or contents of , , ,  and must not instruct, encourage or in any way suggestthat any other person should do so.</w:t>
       </w:r>
     </w:p>
     <w:p>
@@ -445,13 +408,13 @@
     </w:p>
     <w:p>
       <w:r>
-        <w:t>Deputy District Judge Campbell</w:t>
+        <w:t>Deputy District Judge Jane Campbell</w:t>
       </w:r>
     </w:p>
     <w:p/>
     <w:p>
       <w:r>
-        <w:t>12 June 2025</w:t>
+        <w:t>02 June 2026</w:t>
       </w:r>
     </w:p>
     <w:sectPr>

</xml_diff>